<commit_message>
feat: Add resume document, optimize build chunking, and configure Vercel rewrites.
</commit_message>
<xml_diff>
--- a/public/documents/Resume.docx
+++ b/public/documents/Resume.docx
@@ -134,17 +134,7 @@
             <w:szCs w:val="20"/>
             <w:lang w:val="en-PH"/>
           </w:rPr>
-          <w:t>Johnselga1</w:t>
-        </w:r>
-        <w:r>
-          <w:rPr>
-            <w:rStyle w:val="Hyperlink"/>
-            <w:rFonts w:ascii="Caliby body" w:hAnsi="Caliby body"/>
-            <w:sz w:val="20"/>
-            <w:szCs w:val="20"/>
-            <w:lang w:val="en-PH"/>
-          </w:rPr>
-          <w:t>8@gmail.com</w:t>
+          <w:t>Johnselga18@gmail.com</w:t>
         </w:r>
       </w:hyperlink>
       <w:r>
@@ -206,7 +196,7 @@
           <w:szCs w:val="28"/>
         </w:rPr>
         <w:sectPr>
-          <w:pgSz w:w="11906" w:h="16838" w:code="9"/>
+          <w:pgSz w:w="12240" w:h="15840" w:code="1"/>
           <w:pgMar w:top="540" w:right="720" w:bottom="720" w:left="720" w:header="720" w:footer="720" w:gutter="0"/>
           <w:cols w:space="720"/>
           <w:docGrid w:linePitch="360"/>
@@ -451,7 +441,7 @@
         <mc:AlternateContent>
           <mc:Choice Requires="wps">
             <w:drawing>
-              <wp:anchor distT="0" distB="0" distL="114300" distR="114300" simplePos="0" relativeHeight="251671552" behindDoc="0" locked="0" layoutInCell="1" allowOverlap="1" wp14:anchorId="50BD8143" wp14:editId="6E9CEA3F">
+              <wp:anchor distT="0" distB="0" distL="114300" distR="114300" simplePos="0" relativeHeight="251671552" behindDoc="0" locked="0" layoutInCell="1" allowOverlap="1" wp14:anchorId="50BD8143" wp14:editId="42889F7A">
                 <wp:simplePos x="0" y="0"/>
                 <wp:positionH relativeFrom="column">
                   <wp:posOffset>0</wp:posOffset>
@@ -613,15 +603,7 @@
           <w:sz w:val="20"/>
           <w:szCs w:val="18"/>
         </w:rPr>
-        <w:t>Docker,</w:t>
-      </w:r>
-      <w:r>
-        <w:rPr>
-          <w:rFonts w:ascii="Caliby body" w:hAnsi="Caliby body"/>
-          <w:sz w:val="20"/>
-          <w:szCs w:val="18"/>
-        </w:rPr>
-        <w:t xml:space="preserve"> Ubuntu Linux, Apache, Nginx, cPanel, </w:t>
+        <w:t xml:space="preserve">Docker, Ubuntu Linux, Apache, Nginx, cPanel, </w:t>
       </w:r>
       <w:proofErr w:type="spellStart"/>
       <w:r>
@@ -704,23 +686,7 @@
           <w:sz w:val="20"/>
           <w:szCs w:val="18"/>
         </w:rPr>
-        <w:t xml:space="preserve">Git, GitHub, VS Code, Visual Studio, Eclipse, Cursor, Claude Code, </w:t>
-      </w:r>
-      <w:r>
-        <w:rPr>
-          <w:rFonts w:ascii="Caliby body" w:hAnsi="Caliby body"/>
-          <w:sz w:val="20"/>
-          <w:szCs w:val="18"/>
-        </w:rPr>
-        <w:t>Anti-Gravity</w:t>
-      </w:r>
-      <w:r>
-        <w:rPr>
-          <w:rFonts w:ascii="Caliby body" w:hAnsi="Caliby body"/>
-          <w:sz w:val="20"/>
-          <w:szCs w:val="18"/>
-        </w:rPr>
-        <w:t>, Postman, XAMPP</w:t>
+        <w:t>Git, GitHub, VS Code, Visual Studio, Eclipse, Cursor, Claude Code, Anti-Gravity, Postman, XAMPP</w:t>
       </w:r>
     </w:p>
     <w:p>
@@ -759,7 +725,7 @@
         </w:rPr>
         <w:sectPr>
           <w:type w:val="continuous"/>
-          <w:pgSz w:w="11906" w:h="16838" w:code="9"/>
+          <w:pgSz w:w="12240" w:h="15840" w:code="1"/>
           <w:pgMar w:top="90" w:right="720" w:bottom="720" w:left="720" w:header="720" w:footer="720" w:gutter="0"/>
           <w:cols w:num="2" w:space="720"/>
           <w:docGrid w:linePitch="360"/>
@@ -1010,15 +976,6 @@
           <w:szCs w:val="20"/>
         </w:rPr>
         <w:br/>
-      </w:r>
-      <w:r>
-        <w:rPr>
-          <w:rFonts w:ascii="Caliby body" w:hAnsi="Caliby body"/>
-          <w:b/>
-          <w:bCs/>
-          <w:sz w:val="20"/>
-          <w:szCs w:val="20"/>
-        </w:rPr>
         <w:t>Municipality of Santa Rosa Nueva Ecija</w:t>
       </w:r>
     </w:p>
@@ -1085,14 +1042,6 @@
         </w:rPr>
         <w:t xml:space="preserve"> </w:t>
       </w:r>
-      <w:r>
-        <w:rPr>
-          <w:rFonts w:ascii="Caliby body" w:hAnsi="Caliby body"/>
-          <w:sz w:val="20"/>
-          <w:szCs w:val="20"/>
-        </w:rPr>
-        <w:br/>
-      </w:r>
     </w:p>
     <w:p>
       <w:pPr>
@@ -1107,13 +1056,7 @@
         <w:rPr>
           <w:rFonts w:ascii="Caliby body" w:hAnsi="Caliby body"/>
         </w:rPr>
-        <w:t>Field Aid Assessor</w:t>
-      </w:r>
-      <w:r>
-        <w:rPr>
-          <w:rFonts w:ascii="Caliby body" w:hAnsi="Caliby body"/>
-        </w:rPr>
-        <w:t xml:space="preserve"> </w:t>
+        <w:t xml:space="preserve">Field Aid Assessor </w:t>
       </w:r>
       <w:r>
         <w:rPr>
@@ -1193,15 +1136,7 @@
           <w:b w:val="0"/>
           <w:bCs w:val="0"/>
         </w:rPr>
-        <w:t xml:space="preserve"> | Cabanatuan City, Nueva Ecija</w:t>
-      </w:r>
-      <w:r>
-        <w:rPr>
-          <w:rFonts w:ascii="Caliby body" w:hAnsi="Caliby body"/>
-          <w:b w:val="0"/>
-          <w:bCs w:val="0"/>
-        </w:rPr>
-        <w:t xml:space="preserve"> </w:t>
+        <w:t xml:space="preserve"> | Cabanatuan City, Nueva Ecija </w:t>
       </w:r>
     </w:p>
     <w:p>
@@ -1225,14 +1160,6 @@
           <w:lang w:val="en-PH"/>
         </w:rPr>
         <w:t>Evaluated the impact of provincial youth programs by gathering and managing field data across multiple barangays. Coordinated directly with local SK leaders and LGU officials to execute youth activities, while maintaining accurate inventory tracking for relief goods and outreach supplies during provincial operations.</w:t>
-      </w:r>
-      <w:r>
-        <w:rPr>
-          <w:b w:val="0"/>
-          <w:bCs w:val="0"/>
-          <w:lang w:val="en-PH"/>
-        </w:rPr>
-        <w:br/>
       </w:r>
     </w:p>
     <w:p>
@@ -1680,14 +1607,6 @@
         </w:rPr>
         <w:t xml:space="preserve"> and Maya for local payment processing, alongside built-in loyalty and referral programs to boost customer retention and streamline daily shop operations.</w:t>
       </w:r>
-      <w:r>
-        <w:rPr>
-          <w:rFonts w:ascii="Caliby body" w:hAnsi="Caliby body"/>
-          <w:sz w:val="20"/>
-          <w:szCs w:val="20"/>
-        </w:rPr>
-        <w:br/>
-      </w:r>
     </w:p>
     <w:p>
       <w:pPr>
@@ -2085,23 +2004,9 @@
         <w:t xml:space="preserve"> (BSIT)</w:t>
       </w:r>
     </w:p>
-    <w:p>
-      <w:pPr>
-        <w:spacing w:after="0"/>
-        <w:jc w:val="both"/>
-        <w:rPr>
-          <w:rFonts w:ascii="Caliby body" w:hAnsi="Caliby body"/>
-          <w:b/>
-          <w:bCs/>
-          <w:sz w:val="20"/>
-          <w:szCs w:val="20"/>
-          <w:lang w:val="en-PH"/>
-        </w:rPr>
-      </w:pPr>
-    </w:p>
     <w:sectPr>
       <w:type w:val="continuous"/>
-      <w:pgSz w:w="11906" w:h="16838" w:code="9"/>
+      <w:pgSz w:w="12240" w:h="15840" w:code="1"/>
       <w:pgMar w:top="360" w:right="720" w:bottom="720" w:left="720" w:header="720" w:footer="720" w:gutter="0"/>
       <w:cols w:space="720"/>
       <w:docGrid w:linePitch="360"/>
@@ -5766,6 +5671,7 @@
   <w:style w:type="character" w:default="1" w:styleId="DefaultParagraphFont">
     <w:name w:val="Default Paragraph Font"/>
     <w:uiPriority w:val="1"/>
+    <w:semiHidden/>
     <w:unhideWhenUsed/>
   </w:style>
   <w:style w:type="table" w:default="1" w:styleId="TableNormal">

</xml_diff>